<commit_message>
Remove instructor placeholder from title page
</commit_message>
<xml_diff>
--- a/PennyTrack_Project_Plan.docx
+++ b/PennyTrack_Project_Plan.docx
@@ -44,14 +44,6 @@
       </w:pPr>
       <w:r>
         <w:t>Software Engineering</w:t>
-      </w:r>
-    </w:p>
-    <w:p>
-      <w:pPr>
-        <w:jc w:val="center"/>
-      </w:pPr>
-      <w:r>
-        <w:t>Instructor: [Instructor Name]</w:t>
       </w:r>
     </w:p>
     <w:p>

</xml_diff>